<commit_message>
Keep incident worksheet sections together across page breaks
</commit_message>
<xml_diff>
--- a/instructor/incident-analysis-2026-10-12/ACE_Post_Incident_Review_Three_Case_Template.docx
+++ b/instructor/incident-analysis-2026-10-12/ACE_Post_Incident_Review_Three_Case_Template.docx
@@ -7,6 +7,9 @@
         <w:pStyle w:val="Title"/>
       </w:pPr>
       <w:r>
+        <w:rPr>
+          <w:color w:val="000000"/>
+        </w:rPr>
         <w:t>ACE Post Incident Review Formula One Investigations</w:t>
       </w:r>
     </w:p>
@@ -293,17 +296,25 @@
     <w:p>
       <w:pPr>
         <w:pStyle w:val="Heading2"/>
+        <w:keepNext/>
       </w:pPr>
       <w:r>
         <w:t>1. Incident Summary</w:t>
       </w:r>
     </w:p>
     <w:p>
+      <w:pPr>
+        <w:keepNext/>
+      </w:pPr>
       <w:r>
         <w:t>________________________________________________________________________________</w:t>
       </w:r>
     </w:p>
     <w:p>
+      <w:pPr>
+        <w:keepNext w:val="0"/>
+        <w:keepLines/>
+      </w:pPr>
       <w:r>
         <w:t>________________________________________________________________________________</w:t>
       </w:r>
@@ -311,17 +322,25 @@
     <w:p>
       <w:pPr>
         <w:pStyle w:val="Heading2"/>
+        <w:keepNext/>
       </w:pPr>
       <w:r>
         <w:t>2. Impact &amp; Scope</w:t>
       </w:r>
     </w:p>
     <w:p>
+      <w:pPr>
+        <w:keepNext/>
+      </w:pPr>
       <w:r>
         <w:t>________________________________________________________________________________</w:t>
       </w:r>
     </w:p>
     <w:p>
+      <w:pPr>
+        <w:keepNext w:val="0"/>
+        <w:keepLines/>
+      </w:pPr>
       <w:r>
         <w:t>________________________________________________________________________________</w:t>
       </w:r>
@@ -329,17 +348,25 @@
     <w:p>
       <w:pPr>
         <w:pStyle w:val="Heading2"/>
+        <w:keepNext/>
       </w:pPr>
       <w:r>
         <w:t>3. Symptoms &amp; Evidence</w:t>
       </w:r>
     </w:p>
     <w:p>
+      <w:pPr>
+        <w:keepNext/>
+      </w:pPr>
       <w:r>
         <w:t>________________________________________________________________________________</w:t>
       </w:r>
     </w:p>
     <w:p>
+      <w:pPr>
+        <w:keepNext w:val="0"/>
+        <w:keepLines/>
+      </w:pPr>
       <w:r>
         <w:t>________________________________________________________________________________</w:t>
       </w:r>
@@ -347,17 +374,25 @@
     <w:p>
       <w:pPr>
         <w:pStyle w:val="Heading2"/>
+        <w:keepNext/>
       </w:pPr>
       <w:r>
         <w:t>4. Investigation</w:t>
       </w:r>
     </w:p>
     <w:p>
+      <w:pPr>
+        <w:keepNext/>
+      </w:pPr>
       <w:r>
         <w:t>________________________________________________________________________________</w:t>
       </w:r>
     </w:p>
     <w:p>
+      <w:pPr>
+        <w:keepNext w:val="0"/>
+        <w:keepLines/>
+      </w:pPr>
       <w:r>
         <w:t>________________________________________________________________________________</w:t>
       </w:r>
@@ -365,17 +400,25 @@
     <w:p>
       <w:pPr>
         <w:pStyle w:val="Heading2"/>
+        <w:keepNext/>
       </w:pPr>
       <w:r>
         <w:t>5. Response &amp; Escalation</w:t>
       </w:r>
     </w:p>
     <w:p>
+      <w:pPr>
+        <w:keepNext/>
+      </w:pPr>
       <w:r>
         <w:t>________________________________________________________________________________</w:t>
       </w:r>
     </w:p>
     <w:p>
+      <w:pPr>
+        <w:keepNext w:val="0"/>
+        <w:keepLines/>
+      </w:pPr>
       <w:r>
         <w:t>________________________________________________________________________________</w:t>
       </w:r>
@@ -383,17 +426,25 @@
     <w:p>
       <w:pPr>
         <w:pStyle w:val="Heading2"/>
+        <w:keepNext/>
       </w:pPr>
       <w:r>
         <w:t>6. ITIL Lens</w:t>
       </w:r>
     </w:p>
     <w:p>
+      <w:pPr>
+        <w:keepNext/>
+      </w:pPr>
       <w:r>
         <w:t>________________________________________________________________________________</w:t>
       </w:r>
     </w:p>
     <w:p>
+      <w:pPr>
+        <w:keepNext w:val="0"/>
+        <w:keepLines/>
+      </w:pPr>
       <w:r>
         <w:t>________________________________________________________________________________</w:t>
       </w:r>
@@ -401,17 +452,25 @@
     <w:p>
       <w:pPr>
         <w:pStyle w:val="Heading2"/>
+        <w:keepNext/>
       </w:pPr>
       <w:r>
         <w:t>7. Emergency Change Decision</w:t>
       </w:r>
     </w:p>
     <w:p>
+      <w:pPr>
+        <w:keepNext/>
+      </w:pPr>
       <w:r>
         <w:t>________________________________________________________________________________</w:t>
       </w:r>
     </w:p>
     <w:p>
+      <w:pPr>
+        <w:keepNext w:val="0"/>
+        <w:keepLines/>
+      </w:pPr>
       <w:r>
         <w:t>________________________________________________________________________________</w:t>
       </w:r>
@@ -419,17 +478,25 @@
     <w:p>
       <w:pPr>
         <w:pStyle w:val="Heading2"/>
+        <w:keepNext/>
       </w:pPr>
       <w:r>
         <w:t>8. Validation</w:t>
       </w:r>
     </w:p>
     <w:p>
+      <w:pPr>
+        <w:keepNext/>
+      </w:pPr>
       <w:r>
         <w:t>________________________________________________________________________________</w:t>
       </w:r>
     </w:p>
     <w:p>
+      <w:pPr>
+        <w:keepNext w:val="0"/>
+        <w:keepLines/>
+      </w:pPr>
       <w:r>
         <w:t>________________________________________________________________________________</w:t>
       </w:r>
@@ -437,17 +504,25 @@
     <w:p>
       <w:pPr>
         <w:pStyle w:val="Heading2"/>
+        <w:keepNext/>
       </w:pPr>
       <w:r>
         <w:t>9. Incident vs. Problem</w:t>
       </w:r>
     </w:p>
     <w:p>
+      <w:pPr>
+        <w:keepNext/>
+      </w:pPr>
       <w:r>
         <w:t>________________________________________________________________________________</w:t>
       </w:r>
     </w:p>
     <w:p>
+      <w:pPr>
+        <w:keepNext w:val="0"/>
+        <w:keepLines/>
+      </w:pPr>
       <w:r>
         <w:t>________________________________________________________________________________</w:t>
       </w:r>
@@ -455,17 +530,25 @@
     <w:p>
       <w:pPr>
         <w:pStyle w:val="Heading2"/>
+        <w:keepNext/>
       </w:pPr>
       <w:r>
         <w:t>10. Lessons &amp; Recommendations</w:t>
       </w:r>
     </w:p>
     <w:p>
+      <w:pPr>
+        <w:keepNext/>
+      </w:pPr>
       <w:r>
         <w:t>________________________________________________________________________________</w:t>
       </w:r>
     </w:p>
     <w:p>
+      <w:pPr>
+        <w:keepNext w:val="0"/>
+        <w:keepLines/>
+      </w:pPr>
       <w:r>
         <w:t>________________________________________________________________________________</w:t>
       </w:r>
@@ -473,17 +556,25 @@
     <w:p>
       <w:pPr>
         <w:pStyle w:val="Heading2"/>
+        <w:keepNext/>
       </w:pPr>
       <w:r>
         <w:t>11. Reflection: What changes in your own methodology?</w:t>
       </w:r>
     </w:p>
     <w:p>
+      <w:pPr>
+        <w:keepNext/>
+      </w:pPr>
       <w:r>
         <w:t>________________________________________________________________________________</w:t>
       </w:r>
     </w:p>
     <w:p>
+      <w:pPr>
+        <w:keepNext w:val="0"/>
+        <w:keepLines/>
+      </w:pPr>
       <w:r>
         <w:t>________________________________________________________________________________</w:t>
       </w:r>
@@ -1207,9 +1298,6 @@
     <w:qFormat/>
     <w:rsid w:val="00FC693F"/>
     <w:pPr>
-      <w:pBdr>
-        <w:bottom w:val="single" w:sz="8" w:space="4" w:color="4F81BD" w:themeColor="accent1"/>
-      </w:pBdr>
       <w:spacing w:after="300" w:line="240" w:lineRule="auto"/>
       <w:contextualSpacing/>
     </w:pPr>

</xml_diff>